<commit_message>
CV: clickable portfolio, LinkedIn and email links
Co-Authored-By: Claude Opus 5.5 <noreply@anthropic.com>
Claude-Session: https://claude.ai/code/session_01CMn8zBKDwWijX1DHa9YA5f
</commit_message>
<xml_diff>
--- a/cv/Sidharth_K_CV.docx
+++ b/cv/Sidharth_K_CV.docx
@@ -36,13 +36,21 @@
         <w:spacing w:after="0" w:before="0"/>
         <w:jc w:val="center"/>
       </w:pPr>
+      <w:hyperlink r:id="rId9">
+        <w:r>
+          <w:rPr>
+            <w:color w:val="1A3FA8"/>
+            <w:u w:val="single"/>
+            <w:sz w:val="20"/>
+          </w:rPr>
+          <w:t xml:space="preserve">sidharth796@gmail.com</w:t>
+        </w:r>
+      </w:hyperlink>
       <w:r>
         <w:rPr>
-          <w:b w:val="0"/>
-          <w:i w:val="0"/>
           <w:sz w:val="20"/>
         </w:rPr>
-        <w:t>sidharth796@gmail.com | +91 8075112469 | Malappuram, Nilambur, Kerala, India</w:t>
+        <w:t xml:space="preserve"> | +91 8075112469 | Malappuram, Nilambur, Kerala, India</w:t>
       </w:r>
     </w:p>
     <w:p>
@@ -52,12 +60,36 @@
       </w:pPr>
       <w:r>
         <w:rPr>
-          <w:b w:val="0"/>
-          <w:i w:val="0"/>
           <w:sz w:val="20"/>
         </w:rPr>
-        <w:t>LinkedIn: linkedin.com/in/sidharth-k-860a7a192 | Portfolio: sidharthsidhu.github.io</w:t>
+        <w:t xml:space="preserve">Portfolio: </w:t>
       </w:r>
+      <w:hyperlink r:id="rId10">
+        <w:r>
+          <w:rPr>
+            <w:color w:val="1A3FA8"/>
+            <w:u w:val="single"/>
+            <w:sz w:val="20"/>
+          </w:rPr>
+          <w:t xml:space="preserve">https://sidharthsidhu.github.io</w:t>
+        </w:r>
+      </w:hyperlink>
+      <w:r>
+        <w:rPr>
+          <w:sz w:val="20"/>
+        </w:rPr>
+        <w:t xml:space="preserve"> | LinkedIn: </w:t>
+      </w:r>
+      <w:hyperlink r:id="rId11">
+        <w:r>
+          <w:rPr>
+            <w:color w:val="1A3FA8"/>
+            <w:u w:val="single"/>
+            <w:sz w:val="20"/>
+          </w:rPr>
+          <w:t xml:space="preserve">linkedin.com/in/sidharth-k-860a7a192</w:t>
+        </w:r>
+      </w:hyperlink>
     </w:p>
     <w:p>
       <w:pPr>

</xml_diff>

<commit_message>
CV: nearly 6 years IT experience in summary, title Application Developer (.NET)
Co-Authored-By: Claude Opus 5.5 <noreply@anthropic.com>
Claude-Session: https://claude.ai/code/session_01CMn8zBKDwWijX1DHa9YA5f
</commit_message>
<xml_diff>
--- a/cv/Sidharth_K_CV.docx
+++ b/cv/Sidharth_K_CV.docx
@@ -28,7 +28,7 @@
           <w:color w:val="1A3FA8"/>
           <w:sz w:val="23"/>
         </w:rPr>
-        <w:t>Application Developer (.NET) | IT Support Technician</w:t>
+        <w:t>Application Developer (.NET)</w:t>
       </w:r>
     </w:p>
     <w:p>
@@ -117,7 +117,7 @@
           <w:b w:val="0"/>
           <w:i w:val="0"/>
         </w:rPr>
-        <w:t>Application Developer with 3+ years of experience designing, developing, and maintaining scalable web applications using ASP.NET MVC, VB.NET, C#, JavaScript, and SQL Server. Experienced in e-invoicing, logistics, and service management systems, and in building AI-powered features such as document data extraction. Uses AI-assisted development (Claude) to deliver features faster. Brings 2 years of hands-on hardware and software technical support experience. Adept at translating business requirements into efficient technical solutions.</w:t>
+        <w:t>Application Developer with nearly 6 years of IT experience, including 3.5+ years designing, developing, and maintaining scalable web applications using ASP.NET MVC, VB.NET, C#, JavaScript, and SQL Server. Experienced in e-invoicing, logistics, and service management systems, and in building AI-powered features such as document data extraction. Uses AI-assisted development (Claude) to deliver features faster. Strong hands-on foundation in hardware, networking, and systems. Adept at translating business requirements into efficient technical solutions.</w:t>
       </w:r>
     </w:p>
     <w:p>

</xml_diff>

<commit_message>
CV: remove technician role, one-page developer CV (3.5+ years)
Co-Authored-By: Claude Opus 5.5 <noreply@anthropic.com>
Claude-Session: https://claude.ai/code/session_01CMn8zBKDwWijX1DHa9YA5f
</commit_message>
<xml_diff>
--- a/cv/Sidharth_K_CV.docx
+++ b/cv/Sidharth_K_CV.docx
@@ -117,7 +117,7 @@
           <w:b w:val="0"/>
           <w:i w:val="0"/>
         </w:rPr>
-        <w:t>Application Developer with nearly 6 years of IT experience, including 3.5+ years designing, developing, and maintaining scalable web applications using ASP.NET MVC, VB.NET, C#, JavaScript, and SQL Server. Experienced in e-invoicing, logistics, and service management systems, and in building AI-powered features such as document data extraction. Uses AI-assisted development (Claude) to deliver features faster. Strong hands-on foundation in hardware, networking, and systems. Adept at translating business requirements into efficient technical solutions.</w:t>
+        <w:t>Application Developer with 3.5+ years of experience designing, developing, and maintaining scalable web applications using ASP.NET MVC, VB.NET, C#, JavaScript, and SQL Server. Experienced in e-invoicing, logistics, and service management systems, and in building AI-powered features such as document data extraction. Uses AI-assisted development (Claude) to deliver features faster. Strong hands-on knowledge of hardware, networking, and IT support. Adept at translating business requirements into efficient technical solutions.</w:t>
       </w:r>
     </w:p>
     <w:p>
@@ -370,67 +370,6 @@
       </w:pPr>
       <w:r>
         <w:t>Provided IT support to international clients for 3+ months, diagnosing and resolving technical issues under high-pressure conditions.</w:t>
-      </w:r>
-    </w:p>
-    <w:p>
-      <w:pPr>
-        <w:spacing w:after="0" w:before="80"/>
-      </w:pPr>
-      <w:r>
-        <w:rPr>
-          <w:b/>
-          <w:i w:val="0"/>
-          <w:sz w:val="22"/>
-        </w:rPr>
-        <w:t>Hardware &amp; Software Technician</w:t>
-      </w:r>
-    </w:p>
-    <w:p>
-      <w:pPr>
-        <w:spacing w:after="40" w:before="0"/>
-      </w:pPr>
-      <w:r>
-        <w:rPr>
-          <w:b w:val="0"/>
-          <w:i/>
-        </w:rPr>
-        <w:t>Access Computers | Mar 2021 - Feb 2023</w:t>
-      </w:r>
-    </w:p>
-    <w:p>
-      <w:pPr>
-        <w:pStyle w:val="ListBullet"/>
-        <w:spacing w:after="20"/>
-      </w:pPr>
-      <w:r>
-        <w:t>Installed and configured operating systems, hardware components, and software applications for small businesses and individual clients.</w:t>
-      </w:r>
-    </w:p>
-    <w:p>
-      <w:pPr>
-        <w:pStyle w:val="ListBullet"/>
-        <w:spacing w:after="20"/>
-      </w:pPr>
-      <w:r>
-        <w:t>Diagnosed and resolved hardware, network, and software issues, minimizing downtime and improving client satisfaction.</w:t>
-      </w:r>
-    </w:p>
-    <w:p>
-      <w:pPr>
-        <w:pStyle w:val="ListBullet"/>
-        <w:spacing w:after="20"/>
-      </w:pPr>
-      <w:r>
-        <w:t>Managed preventive maintenance and performance optimization for desktops and laptops.</w:t>
-      </w:r>
-    </w:p>
-    <w:p>
-      <w:pPr>
-        <w:pStyle w:val="ListBullet"/>
-        <w:spacing w:after="20"/>
-      </w:pPr>
-      <w:r>
-        <w:t>Provided guidance on IT upgrades, software deployments, and infrastructure improvements.</w:t>
       </w:r>
     </w:p>
     <w:p>

</xml_diff>